<commit_message>
Update dates in Burnova app survey research protocol
作成日：2026年3月21日
アプリ公開日（データ収集開始日）：2026年3月23日

https://claude.ai/code/session_01RCGppDTdwwVqLmLXWR6Vjx
</commit_message>
<xml_diff>
--- a/研究実施計画書_Burnova_アプリアンケート_v1.docx
+++ b/研究実施計画書_Burnova_アプリアンケート_v1.docx
@@ -38,7 +38,7 @@
         <w:rPr>
           <w:sz w:val="21"/>
         </w:rPr>
-        <w:t xml:space="preserve">　　　年　　月　　日作成　第１版</w:t>
+        <w:t>2026年3月21日作成　第１版</w:t>
       </w:r>
     </w:p>
     <w:p/>
@@ -1297,7 +1297,7 @@
               <w:rPr>
                 <w:sz w:val="21"/>
               </w:rPr>
-              <w:t>アプリ公開日（　　　年　　月　　日）〜 2030年3月31日</w:t>
+              <w:t>アプリ公開日（2026年3月23日）〜 2030年3月31日</w:t>
             </w:r>
           </w:p>
         </w:tc>

</xml_diff>

<commit_message>
Fix 4 issues in research protocol v1
①誤字修正：「症例すう」→「症例数」
②誤記修正：「ケースは少ない」→「ケースは少なくない」
③研究期間統一：概要表・研究期間章ともに2031年12月31日に統一
④4.3観察項目に⑪最終押下ボタン・⑫行動決定までの時間を追記
　（個人情報欄との整合性を確保）
　研究体制に役割説明注記を追加（他施設協力者はデータ解析・学術発表のみ）

https://claude.ai/code/session_01RCGppDTdwwVqLmLXWR6Vjx
</commit_message>
<xml_diff>
--- a/研究実施計画書_Burnova_アプリアンケート_v1.docx
+++ b/研究実施計画書_Burnova_アプリアンケート_v1.docx
@@ -11,7 +11,7 @@
           <w:b/>
           <w:sz w:val="26"/>
         </w:rPr>
-        <w:t>課題名: 市民向け熱傷情報啓発アプリ「Burnova」の</w:t>
+        <w:t>課題名：　市民向け熱傷情報啓発アプリ「Burnova」の</w:t>
         <w:br/>
         <w:t>有用性と利用実態に関するアンケート調査研究</w:t>
       </w:r>
@@ -30,6 +30,13 @@
       </w:r>
     </w:p>
     <w:p/>
+    <w:p/>
+    <w:p/>
+    <w:p/>
+    <w:p/>
+    <w:p/>
+    <w:p/>
+    <w:p/>
     <w:p>
       <w:pPr>
         <w:jc w:val="right"/>
@@ -41,7 +48,11 @@
         <w:t>2026年3月21日作成　第１版</w:t>
       </w:r>
     </w:p>
-    <w:p/>
+    <w:p>
+      <w:r>
+        <w:br w:type="page"/>
+      </w:r>
+    </w:p>
     <w:p>
       <w:pPr>
         <w:spacing w:before="240" w:after="40"/>
@@ -54,18 +65,167 @@
         <w:t>概要</w:t>
       </w:r>
     </w:p>
-    <w:p>
-      <w:pPr>
-        <w:spacing w:after="40"/>
-        <w:ind w:left="567"/>
-      </w:pPr>
-      <w:r>
-        <w:rPr>
-          <w:sz w:val="21"/>
-        </w:rPr>
-        <w:t>本研究は、熱傷受傷直後の市民に対し正確な応急処置・受診判断情報を提供することを目的として開発した市民向け熱傷情報啓発アプリ「Burnova」の有用性と利用実態を、アプリ内アンケートへの任意回答データを用いて評価する横断的観察研究である。収集するデータは匿名情報に限定し、個人を特定できる情報は一切取得しない。アプリ内に研究利用に関する告知を行いオプトアウト方式によるインフォームド・コンセントを得る。本研究の結果は、熱傷啓発ツールの改善および熱傷予防・初期対応に関する公衆衛生的エビデンスの蓄積に資することが期待される。</w:t>
-      </w:r>
-    </w:p>
+    <w:tbl>
+      <w:tblPr>
+        <w:tblStyle w:val="TableGrid"/>
+        <w:tblW w:type="auto" w:w="0"/>
+        <w:tblLook w:firstColumn="1" w:firstRow="1" w:lastColumn="0" w:lastRow="0" w:noHBand="0" w:noVBand="1" w:val="04A0"/>
+      </w:tblPr>
+      <w:tblGrid>
+        <w:gridCol w:w="4561"/>
+        <w:gridCol w:w="4561"/>
+      </w:tblGrid>
+      <w:tr>
+        <w:tc>
+          <w:tcPr>
+            <w:tcW w:type="dxa" w:w="4561"/>
+          </w:tcPr>
+          <w:p>
+            <w:r>
+              <w:rPr>
+                <w:rFonts w:ascii="MS Mincho" w:hAnsi="MS Mincho"/>
+                <w:sz w:val="21"/>
+              </w:rPr>
+              <w:t>目的</w:t>
+            </w:r>
+          </w:p>
+        </w:tc>
+        <w:tc>
+          <w:tcPr>
+            <w:tcW w:type="dxa" w:w="4561"/>
+          </w:tcPr>
+          <w:p>
+            <w:r>
+              <w:rPr>
+                <w:rFonts w:ascii="MS Mincho" w:hAnsi="MS Mincho"/>
+                <w:sz w:val="21"/>
+              </w:rPr>
+              <w:t>一般市民向けの熱傷情報啓発アプリ「Burnova」を開発した。本研究では利用者に対するアンケート調査を行い、熱傷を受傷した一般市民にとっての本アプリの有用性を評価することを目的とする。</w:t>
+            </w:r>
+          </w:p>
+        </w:tc>
+      </w:tr>
+      <w:tr>
+        <w:tc>
+          <w:tcPr>
+            <w:tcW w:type="dxa" w:w="4561"/>
+          </w:tcPr>
+          <w:p>
+            <w:r>
+              <w:rPr>
+                <w:rFonts w:ascii="MS Mincho" w:hAnsi="MS Mincho"/>
+                <w:sz w:val="21"/>
+              </w:rPr>
+              <w:t>対象</w:t>
+            </w:r>
+          </w:p>
+        </w:tc>
+        <w:tc>
+          <w:tcPr>
+            <w:tcW w:type="dxa" w:w="4561"/>
+          </w:tcPr>
+          <w:p>
+            <w:r>
+              <w:rPr>
+                <w:rFonts w:ascii="MS Mincho" w:hAnsi="MS Mincho"/>
+                <w:sz w:val="21"/>
+              </w:rPr>
+              <w:t>熱傷情報啓発アプリ「Burnova」の利用者（一般市民）</w:t>
+            </w:r>
+          </w:p>
+        </w:tc>
+      </w:tr>
+      <w:tr>
+        <w:tc>
+          <w:tcPr>
+            <w:tcW w:type="dxa" w:w="4561"/>
+          </w:tcPr>
+          <w:p>
+            <w:r>
+              <w:rPr>
+                <w:rFonts w:ascii="MS Mincho" w:hAnsi="MS Mincho"/>
+                <w:sz w:val="21"/>
+              </w:rPr>
+              <w:t>予定参加者数</w:t>
+            </w:r>
+          </w:p>
+        </w:tc>
+        <w:tc>
+          <w:tcPr>
+            <w:tcW w:type="dxa" w:w="4561"/>
+          </w:tcPr>
+          <w:p>
+            <w:r>
+              <w:rPr>
+                <w:rFonts w:ascii="MS Mincho" w:hAnsi="MS Mincho"/>
+                <w:sz w:val="21"/>
+              </w:rPr>
+              <w:t>疫学的な分析を行う研究であり、目標症例数は設定せず、幅広くアンケートを集積する。</w:t>
+            </w:r>
+          </w:p>
+        </w:tc>
+      </w:tr>
+      <w:tr>
+        <w:tc>
+          <w:tcPr>
+            <w:tcW w:type="dxa" w:w="4561"/>
+          </w:tcPr>
+          <w:p>
+            <w:r>
+              <w:rPr>
+                <w:rFonts w:ascii="MS Mincho" w:hAnsi="MS Mincho"/>
+                <w:sz w:val="21"/>
+              </w:rPr>
+              <w:t>研究概要</w:t>
+            </w:r>
+          </w:p>
+        </w:tc>
+        <w:tc>
+          <w:tcPr>
+            <w:tcW w:type="dxa" w:w="4561"/>
+          </w:tcPr>
+          <w:p>
+            <w:r>
+              <w:rPr>
+                <w:rFonts w:ascii="MS Mincho" w:hAnsi="MS Mincho"/>
+                <w:sz w:val="21"/>
+              </w:rPr>
+              <w:t>本研究は、熱傷受傷直後の市民に対し正確な応急処置・受診判断情報を提供することを目的として開発した市民向け熱傷情報啓発アプリ「Burnova」の有用性と利用実態を、アプリ内アンケートへの任意回答データを用いて評価する横断的観察研究である。収集するデータは匿名情報に限定し、個人を特定できる情報は一切取得しない。アプリ内に研究利用に関する告知を行いオプトアウト方式によるインフォームド・コンセントを得る。本研究の結果は、熱傷啓発ツールの改善および熱傷予防・初期対応に関する公衆衛生的エビデンスの蓄積に資することが期待される。</w:t>
+            </w:r>
+          </w:p>
+        </w:tc>
+      </w:tr>
+      <w:tr>
+        <w:tc>
+          <w:tcPr>
+            <w:tcW w:type="dxa" w:w="4561"/>
+          </w:tcPr>
+          <w:p>
+            <w:r>
+              <w:rPr>
+                <w:rFonts w:ascii="MS Mincho" w:hAnsi="MS Mincho"/>
+                <w:sz w:val="21"/>
+              </w:rPr>
+              <w:t>実施予定期間</w:t>
+            </w:r>
+          </w:p>
+        </w:tc>
+        <w:tc>
+          <w:tcPr>
+            <w:tcW w:type="dxa" w:w="4561"/>
+          </w:tcPr>
+          <w:p>
+            <w:r>
+              <w:rPr>
+                <w:rFonts w:ascii="MS Mincho" w:hAnsi="MS Mincho"/>
+                <w:sz w:val="21"/>
+              </w:rPr>
+              <w:t>研究機関の長の許可日 〜 2031年12月31日</w:t>
+            </w:r>
+          </w:p>
+        </w:tc>
+      </w:tr>
+    </w:tbl>
     <w:p>
       <w:pPr>
         <w:spacing w:before="240" w:after="40"/>
@@ -78,68 +238,6 @@
         <w:t>研究の実施体制</w:t>
       </w:r>
     </w:p>
-    <w:p>
-      <w:pPr>
-        <w:spacing w:before="120" w:after="40"/>
-        <w:ind w:left="283"/>
-      </w:pPr>
-      <w:r>
-        <w:rPr>
-          <w:b/>
-          <w:sz w:val="21"/>
-        </w:rPr>
-        <w:t>研究責任者</w:t>
-      </w:r>
-    </w:p>
-    <w:p>
-      <w:pPr>
-        <w:spacing w:after="40"/>
-        <w:ind w:left="567"/>
-      </w:pPr>
-      <w:r>
-        <w:rPr>
-          <w:sz w:val="21"/>
-        </w:rPr>
-        <w:t>大阪大学医学部附属病院　高度救命救急センター　特任助教　米田　和弘</w:t>
-      </w:r>
-    </w:p>
-    <w:p>
-      <w:pPr>
-        <w:spacing w:after="40"/>
-        <w:ind w:left="567"/>
-      </w:pPr>
-      <w:r>
-        <w:rPr>
-          <w:sz w:val="21"/>
-        </w:rPr>
-        <w:t>〒565-0871　大阪府吹田市山田丘2-15</w:t>
-      </w:r>
-    </w:p>
-    <w:p>
-      <w:pPr>
-        <w:spacing w:after="40"/>
-        <w:ind w:left="567"/>
-      </w:pPr>
-      <w:r>
-        <w:rPr>
-          <w:sz w:val="21"/>
-        </w:rPr>
-        <w:t>TEL：06-6879-5111</w:t>
-      </w:r>
-    </w:p>
-    <w:p>
-      <w:pPr>
-        <w:spacing w:before="120" w:after="40"/>
-        <w:ind w:left="283"/>
-      </w:pPr>
-      <w:r>
-        <w:rPr>
-          <w:b/>
-          <w:sz w:val="21"/>
-        </w:rPr>
-        <w:t>研究協力者</w:t>
-      </w:r>
-    </w:p>
     <w:tbl>
       <w:tblPr>
         <w:tblStyle w:val="TableGrid"/>
@@ -147,19 +245,35 @@
         <w:tblLook w:firstColumn="1" w:firstRow="1" w:lastColumn="0" w:lastRow="0" w:noHBand="0" w:noVBand="1" w:val="04A0"/>
       </w:tblPr>
       <w:tblGrid>
-        <w:gridCol w:w="3041"/>
-        <w:gridCol w:w="3041"/>
-        <w:gridCol w:w="3041"/>
+        <w:gridCol w:w="2280"/>
+        <w:gridCol w:w="2280"/>
+        <w:gridCol w:w="2280"/>
+        <w:gridCol w:w="2280"/>
       </w:tblGrid>
       <w:tr>
         <w:tc>
           <w:tcPr>
-            <w:tcW w:type="dxa" w:w="3041"/>
+            <w:tcW w:type="dxa" w:w="2280"/>
           </w:tcPr>
           <w:p>
             <w:r>
               <w:rPr>
-                <w:sz w:val="20"/>
+                <w:b/>
+                <w:sz w:val="21"/>
+              </w:rPr>
+              <w:t>役割</w:t>
+            </w:r>
+          </w:p>
+        </w:tc>
+        <w:tc>
+          <w:tcPr>
+            <w:tcW w:type="dxa" w:w="2280"/>
+          </w:tcPr>
+          <w:p>
+            <w:r>
+              <w:rPr>
+                <w:b/>
+                <w:sz w:val="21"/>
               </w:rPr>
               <w:t>氏名</w:t>
             </w:r>
@@ -167,12 +281,13 @@
         </w:tc>
         <w:tc>
           <w:tcPr>
-            <w:tcW w:type="dxa" w:w="3041"/>
+            <w:tcW w:type="dxa" w:w="2280"/>
           </w:tcPr>
           <w:p>
             <w:r>
               <w:rPr>
-                <w:sz w:val="20"/>
+                <w:b/>
+                <w:sz w:val="21"/>
               </w:rPr>
               <w:t>職名</w:t>
             </w:r>
@@ -180,12 +295,13 @@
         </w:tc>
         <w:tc>
           <w:tcPr>
-            <w:tcW w:type="dxa" w:w="3041"/>
+            <w:tcW w:type="dxa" w:w="2280"/>
           </w:tcPr>
           <w:p>
             <w:r>
               <w:rPr>
-                <w:sz w:val="20"/>
+                <w:b/>
+                <w:sz w:val="21"/>
               </w:rPr>
               <w:t>所属</w:t>
             </w:r>
@@ -195,24 +311,40 @@
       <w:tr>
         <w:tc>
           <w:tcPr>
-            <w:tcW w:type="dxa" w:w="3041"/>
+            <w:tcW w:type="dxa" w:w="2280"/>
           </w:tcPr>
           <w:p>
             <w:r>
               <w:rPr>
+                <w:rFonts w:ascii="MS Mincho" w:hAnsi="MS Mincho"/>
                 <w:sz w:val="20"/>
               </w:rPr>
-              <w:t>蛯原　健</w:t>
+              <w:t>責任者</w:t>
             </w:r>
           </w:p>
         </w:tc>
         <w:tc>
           <w:tcPr>
-            <w:tcW w:type="dxa" w:w="3041"/>
+            <w:tcW w:type="dxa" w:w="2280"/>
           </w:tcPr>
           <w:p>
             <w:r>
               <w:rPr>
+                <w:rFonts w:ascii="MS Mincho" w:hAnsi="MS Mincho"/>
+                <w:sz w:val="20"/>
+              </w:rPr>
+              <w:t>米田和弘</w:t>
+            </w:r>
+          </w:p>
+        </w:tc>
+        <w:tc>
+          <w:tcPr>
+            <w:tcW w:type="dxa" w:w="2280"/>
+          </w:tcPr>
+          <w:p>
+            <w:r>
+              <w:rPr>
+                <w:rFonts w:ascii="MS Mincho" w:hAnsi="MS Mincho"/>
                 <w:sz w:val="20"/>
               </w:rPr>
               <w:t>特任助教</w:t>
@@ -221,14 +353,15 @@
         </w:tc>
         <w:tc>
           <w:tcPr>
-            <w:tcW w:type="dxa" w:w="3041"/>
+            <w:tcW w:type="dxa" w:w="2280"/>
           </w:tcPr>
           <w:p>
             <w:r>
               <w:rPr>
+                <w:rFonts w:ascii="MS Mincho" w:hAnsi="MS Mincho"/>
                 <w:sz w:val="20"/>
               </w:rPr>
-              <w:t>大阪大学医学部附属病院　高度救命救急センター</w:t>
+              <w:t>大阪大学大学院医学系研究科生体統御医学（救急医学）</w:t>
             </w:r>
           </w:p>
         </w:tc>
@@ -236,24 +369,40 @@
       <w:tr>
         <w:tc>
           <w:tcPr>
-            <w:tcW w:type="dxa" w:w="3041"/>
+            <w:tcW w:type="dxa" w:w="2280"/>
           </w:tcPr>
           <w:p>
             <w:r>
               <w:rPr>
+                <w:rFonts w:ascii="MS Mincho" w:hAnsi="MS Mincho"/>
                 <w:sz w:val="20"/>
               </w:rPr>
-              <w:t>梅村　穣</w:t>
+              <w:t>協力者</w:t>
             </w:r>
           </w:p>
         </w:tc>
         <w:tc>
           <w:tcPr>
-            <w:tcW w:type="dxa" w:w="3041"/>
+            <w:tcW w:type="dxa" w:w="2280"/>
           </w:tcPr>
           <w:p>
             <w:r>
               <w:rPr>
+                <w:rFonts w:ascii="MS Mincho" w:hAnsi="MS Mincho"/>
+                <w:sz w:val="20"/>
+              </w:rPr>
+              <w:t>蛯原健</w:t>
+            </w:r>
+          </w:p>
+        </w:tc>
+        <w:tc>
+          <w:tcPr>
+            <w:tcW w:type="dxa" w:w="2280"/>
+          </w:tcPr>
+          <w:p>
+            <w:r>
+              <w:rPr>
+                <w:rFonts w:ascii="MS Mincho" w:hAnsi="MS Mincho"/>
                 <w:sz w:val="20"/>
               </w:rPr>
               <w:t>特任助教</w:t>
@@ -262,14 +411,15 @@
         </w:tc>
         <w:tc>
           <w:tcPr>
-            <w:tcW w:type="dxa" w:w="3041"/>
+            <w:tcW w:type="dxa" w:w="2280"/>
           </w:tcPr>
           <w:p>
             <w:r>
               <w:rPr>
+                <w:rFonts w:ascii="MS Mincho" w:hAnsi="MS Mincho"/>
                 <w:sz w:val="20"/>
               </w:rPr>
-              <w:t>大阪大学医学部附属病院　高度救命救急センター</w:t>
+              <w:t>大阪大学大学院医学系研究科生体統御医学（救急医学）</w:t>
             </w:r>
           </w:p>
         </w:tc>
@@ -277,24 +427,98 @@
       <w:tr>
         <w:tc>
           <w:tcPr>
-            <w:tcW w:type="dxa" w:w="3041"/>
+            <w:tcW w:type="dxa" w:w="2280"/>
           </w:tcPr>
           <w:p>
             <w:r>
               <w:rPr>
+                <w:rFonts w:ascii="MS Mincho" w:hAnsi="MS Mincho"/>
                 <w:sz w:val="20"/>
               </w:rPr>
-              <w:t>廣瀬　智也</w:t>
+              <w:t>協力者</w:t>
             </w:r>
           </w:p>
         </w:tc>
         <w:tc>
           <w:tcPr>
-            <w:tcW w:type="dxa" w:w="3041"/>
+            <w:tcW w:type="dxa" w:w="2280"/>
           </w:tcPr>
           <w:p>
             <w:r>
               <w:rPr>
+                <w:rFonts w:ascii="MS Mincho" w:hAnsi="MS Mincho"/>
+                <w:sz w:val="20"/>
+              </w:rPr>
+              <w:t>梅村穣</w:t>
+            </w:r>
+          </w:p>
+        </w:tc>
+        <w:tc>
+          <w:tcPr>
+            <w:tcW w:type="dxa" w:w="2280"/>
+          </w:tcPr>
+          <w:p>
+            <w:r>
+              <w:rPr>
+                <w:rFonts w:ascii="MS Mincho" w:hAnsi="MS Mincho"/>
+                <w:sz w:val="20"/>
+              </w:rPr>
+              <w:t>特任助教</w:t>
+            </w:r>
+          </w:p>
+        </w:tc>
+        <w:tc>
+          <w:tcPr>
+            <w:tcW w:type="dxa" w:w="2280"/>
+          </w:tcPr>
+          <w:p>
+            <w:r>
+              <w:rPr>
+                <w:rFonts w:ascii="MS Mincho" w:hAnsi="MS Mincho"/>
+                <w:sz w:val="20"/>
+              </w:rPr>
+              <w:t>大阪大学大学院医学系研究科生体統御医学（救急医学）</w:t>
+            </w:r>
+          </w:p>
+        </w:tc>
+      </w:tr>
+      <w:tr>
+        <w:tc>
+          <w:tcPr>
+            <w:tcW w:type="dxa" w:w="2280"/>
+          </w:tcPr>
+          <w:p>
+            <w:r>
+              <w:rPr>
+                <w:rFonts w:ascii="MS Mincho" w:hAnsi="MS Mincho"/>
+                <w:sz w:val="20"/>
+              </w:rPr>
+              <w:t>協力者</w:t>
+            </w:r>
+          </w:p>
+        </w:tc>
+        <w:tc>
+          <w:tcPr>
+            <w:tcW w:type="dxa" w:w="2280"/>
+          </w:tcPr>
+          <w:p>
+            <w:r>
+              <w:rPr>
+                <w:rFonts w:ascii="MS Mincho" w:hAnsi="MS Mincho"/>
+                <w:sz w:val="20"/>
+              </w:rPr>
+              <w:t>廣瀬智也</w:t>
+            </w:r>
+          </w:p>
+        </w:tc>
+        <w:tc>
+          <w:tcPr>
+            <w:tcW w:type="dxa" w:w="2280"/>
+          </w:tcPr>
+          <w:p>
+            <w:r>
+              <w:rPr>
+                <w:rFonts w:ascii="MS Mincho" w:hAnsi="MS Mincho"/>
                 <w:sz w:val="20"/>
               </w:rPr>
               <w:t>助教</w:t>
@@ -303,14 +527,15 @@
         </w:tc>
         <w:tc>
           <w:tcPr>
-            <w:tcW w:type="dxa" w:w="3041"/>
+            <w:tcW w:type="dxa" w:w="2280"/>
           </w:tcPr>
           <w:p>
             <w:r>
               <w:rPr>
+                <w:rFonts w:ascii="MS Mincho" w:hAnsi="MS Mincho"/>
                 <w:sz w:val="20"/>
               </w:rPr>
-              <w:t>大阪大学医学部附属病院　高度救命救急センター</w:t>
+              <w:t>大阪大学大学院医学系研究科生体統御医学（救急医学）</w:t>
             </w:r>
           </w:p>
         </w:tc>
@@ -318,24 +543,40 @@
       <w:tr>
         <w:tc>
           <w:tcPr>
-            <w:tcW w:type="dxa" w:w="3041"/>
+            <w:tcW w:type="dxa" w:w="2280"/>
           </w:tcPr>
           <w:p>
             <w:r>
               <w:rPr>
+                <w:rFonts w:ascii="MS Mincho" w:hAnsi="MS Mincho"/>
                 <w:sz w:val="20"/>
               </w:rPr>
-              <w:t>酒井　智彦</w:t>
+              <w:t>協力者</w:t>
             </w:r>
           </w:p>
         </w:tc>
         <w:tc>
           <w:tcPr>
-            <w:tcW w:type="dxa" w:w="3041"/>
+            <w:tcW w:type="dxa" w:w="2280"/>
           </w:tcPr>
           <w:p>
             <w:r>
               <w:rPr>
+                <w:rFonts w:ascii="MS Mincho" w:hAnsi="MS Mincho"/>
+                <w:sz w:val="20"/>
+              </w:rPr>
+              <w:t>酒井智彦</w:t>
+            </w:r>
+          </w:p>
+        </w:tc>
+        <w:tc>
+          <w:tcPr>
+            <w:tcW w:type="dxa" w:w="2280"/>
+          </w:tcPr>
+          <w:p>
+            <w:r>
+              <w:rPr>
+                <w:rFonts w:ascii="MS Mincho" w:hAnsi="MS Mincho"/>
                 <w:sz w:val="20"/>
               </w:rPr>
               <w:t>助教</w:t>
@@ -344,14 +585,15 @@
         </w:tc>
         <w:tc>
           <w:tcPr>
-            <w:tcW w:type="dxa" w:w="3041"/>
+            <w:tcW w:type="dxa" w:w="2280"/>
           </w:tcPr>
           <w:p>
             <w:r>
               <w:rPr>
+                <w:rFonts w:ascii="MS Mincho" w:hAnsi="MS Mincho"/>
                 <w:sz w:val="20"/>
               </w:rPr>
-              <w:t>大阪大学医学部附属病院　高度救命救急センター</w:t>
+              <w:t>大阪大学大学院医学系研究科生体統御医学（救急医学）</w:t>
             </w:r>
           </w:p>
         </w:tc>
@@ -359,24 +601,40 @@
       <w:tr>
         <w:tc>
           <w:tcPr>
-            <w:tcW w:type="dxa" w:w="3041"/>
+            <w:tcW w:type="dxa" w:w="2280"/>
           </w:tcPr>
           <w:p>
             <w:r>
               <w:rPr>
+                <w:rFonts w:ascii="MS Mincho" w:hAnsi="MS Mincho"/>
                 <w:sz w:val="20"/>
               </w:rPr>
-              <w:t>織田　順</w:t>
+              <w:t>協力者</w:t>
             </w:r>
           </w:p>
         </w:tc>
         <w:tc>
           <w:tcPr>
-            <w:tcW w:type="dxa" w:w="3041"/>
+            <w:tcW w:type="dxa" w:w="2280"/>
           </w:tcPr>
           <w:p>
             <w:r>
               <w:rPr>
+                <w:rFonts w:ascii="MS Mincho" w:hAnsi="MS Mincho"/>
+                <w:sz w:val="20"/>
+              </w:rPr>
+              <w:t>織田順</w:t>
+            </w:r>
+          </w:p>
+        </w:tc>
+        <w:tc>
+          <w:tcPr>
+            <w:tcW w:type="dxa" w:w="2280"/>
+          </w:tcPr>
+          <w:p>
+            <w:r>
+              <w:rPr>
+                <w:rFonts w:ascii="MS Mincho" w:hAnsi="MS Mincho"/>
                 <w:sz w:val="20"/>
               </w:rPr>
               <w:t>教授</w:t>
@@ -385,14 +643,255 @@
         </w:tc>
         <w:tc>
           <w:tcPr>
-            <w:tcW w:type="dxa" w:w="3041"/>
+            <w:tcW w:type="dxa" w:w="2280"/>
           </w:tcPr>
           <w:p>
             <w:r>
               <w:rPr>
+                <w:rFonts w:ascii="MS Mincho" w:hAnsi="MS Mincho"/>
                 <w:sz w:val="20"/>
               </w:rPr>
-              <w:t>大阪大学医学部附属病院　高度救命救急センター</w:t>
+              <w:t>大阪大学大学院医学系研究科生体統御医学（救急医学）</w:t>
+            </w:r>
+          </w:p>
+        </w:tc>
+      </w:tr>
+      <w:tr>
+        <w:tc>
+          <w:tcPr>
+            <w:tcW w:type="dxa" w:w="2280"/>
+          </w:tcPr>
+          <w:p>
+            <w:r>
+              <w:rPr>
+                <w:rFonts w:ascii="MS Mincho" w:hAnsi="MS Mincho"/>
+                <w:sz w:val="20"/>
+              </w:rPr>
+              <w:t>研究協力者</w:t>
+              <w:br/>
+              <w:t>（データ解析・学術発表）</w:t>
+            </w:r>
+          </w:p>
+        </w:tc>
+        <w:tc>
+          <w:tcPr>
+            <w:tcW w:type="dxa" w:w="2280"/>
+          </w:tcPr>
+          <w:p>
+            <w:r>
+              <w:rPr>
+                <w:rFonts w:ascii="MS Mincho" w:hAnsi="MS Mincho"/>
+                <w:sz w:val="20"/>
+              </w:rPr>
+              <w:t>松浦裕司</w:t>
+            </w:r>
+          </w:p>
+        </w:tc>
+        <w:tc>
+          <w:tcPr>
+            <w:tcW w:type="dxa" w:w="2280"/>
+          </w:tcPr>
+          <w:p>
+            <w:r>
+              <w:rPr>
+                <w:rFonts w:ascii="MS Mincho" w:hAnsi="MS Mincho"/>
+                <w:sz w:val="20"/>
+              </w:rPr>
+              <w:t>医務部長</w:t>
+            </w:r>
+          </w:p>
+        </w:tc>
+        <w:tc>
+          <w:tcPr>
+            <w:tcW w:type="dxa" w:w="2280"/>
+          </w:tcPr>
+          <w:p>
+            <w:r>
+              <w:rPr>
+                <w:rFonts w:ascii="MS Mincho" w:hAnsi="MS Mincho"/>
+                <w:sz w:val="20"/>
+              </w:rPr>
+              <w:t>大阪府立中河内救命救急センター</w:t>
+            </w:r>
+          </w:p>
+        </w:tc>
+      </w:tr>
+      <w:tr>
+        <w:tc>
+          <w:tcPr>
+            <w:tcW w:type="dxa" w:w="2280"/>
+          </w:tcPr>
+          <w:p>
+            <w:r>
+              <w:rPr>
+                <w:rFonts w:ascii="MS Mincho" w:hAnsi="MS Mincho"/>
+                <w:sz w:val="20"/>
+              </w:rPr>
+              <w:t>研究協力者</w:t>
+              <w:br/>
+              <w:t>（データ解析・学術発表）</w:t>
+            </w:r>
+          </w:p>
+        </w:tc>
+        <w:tc>
+          <w:tcPr>
+            <w:tcW w:type="dxa" w:w="2280"/>
+          </w:tcPr>
+          <w:p>
+            <w:r>
+              <w:rPr>
+                <w:rFonts w:ascii="MS Mincho" w:hAnsi="MS Mincho"/>
+                <w:sz w:val="20"/>
+              </w:rPr>
+              <w:t>大須賀章倫</w:t>
+            </w:r>
+          </w:p>
+        </w:tc>
+        <w:tc>
+          <w:tcPr>
+            <w:tcW w:type="dxa" w:w="2280"/>
+          </w:tcPr>
+          <w:p>
+            <w:r>
+              <w:rPr>
+                <w:rFonts w:ascii="MS Mincho" w:hAnsi="MS Mincho"/>
+                <w:sz w:val="20"/>
+              </w:rPr>
+              <w:t>第1救命センター長</w:t>
+            </w:r>
+          </w:p>
+        </w:tc>
+        <w:tc>
+          <w:tcPr>
+            <w:tcW w:type="dxa" w:w="2280"/>
+          </w:tcPr>
+          <w:p>
+            <w:r>
+              <w:rPr>
+                <w:rFonts w:ascii="MS Mincho" w:hAnsi="MS Mincho"/>
+                <w:sz w:val="20"/>
+              </w:rPr>
+              <w:t>JCHO中京病院</w:t>
+            </w:r>
+          </w:p>
+        </w:tc>
+      </w:tr>
+      <w:tr>
+        <w:tc>
+          <w:tcPr>
+            <w:tcW w:type="dxa" w:w="2280"/>
+          </w:tcPr>
+          <w:p>
+            <w:r>
+              <w:rPr>
+                <w:rFonts w:ascii="MS Mincho" w:hAnsi="MS Mincho"/>
+                <w:sz w:val="20"/>
+              </w:rPr>
+              <w:t>研究協力者</w:t>
+              <w:br/>
+              <w:t>（データ解析・学術発表）</w:t>
+            </w:r>
+          </w:p>
+        </w:tc>
+        <w:tc>
+          <w:tcPr>
+            <w:tcW w:type="dxa" w:w="2280"/>
+          </w:tcPr>
+          <w:p>
+            <w:r>
+              <w:rPr>
+                <w:rFonts w:ascii="MS Mincho" w:hAnsi="MS Mincho"/>
+                <w:sz w:val="20"/>
+              </w:rPr>
+              <w:t>大西伸也</w:t>
+            </w:r>
+          </w:p>
+        </w:tc>
+        <w:tc>
+          <w:tcPr>
+            <w:tcW w:type="dxa" w:w="2280"/>
+          </w:tcPr>
+          <w:p>
+            <w:r>
+              <w:rPr>
+                <w:rFonts w:ascii="MS Mincho" w:hAnsi="MS Mincho"/>
+                <w:sz w:val="20"/>
+              </w:rPr>
+              <w:t>医員</w:t>
+            </w:r>
+          </w:p>
+        </w:tc>
+        <w:tc>
+          <w:tcPr>
+            <w:tcW w:type="dxa" w:w="2280"/>
+          </w:tcPr>
+          <w:p>
+            <w:r>
+              <w:rPr>
+                <w:rFonts w:ascii="MS Mincho" w:hAnsi="MS Mincho"/>
+                <w:sz w:val="20"/>
+              </w:rPr>
+              <w:t>JCHO中京病院</w:t>
+            </w:r>
+          </w:p>
+        </w:tc>
+      </w:tr>
+      <w:tr>
+        <w:tc>
+          <w:tcPr>
+            <w:tcW w:type="dxa" w:w="2280"/>
+          </w:tcPr>
+          <w:p>
+            <w:r>
+              <w:rPr>
+                <w:rFonts w:ascii="MS Mincho" w:hAnsi="MS Mincho"/>
+                <w:sz w:val="20"/>
+              </w:rPr>
+              <w:t>研究協力者</w:t>
+              <w:br/>
+              <w:t>（データ解析・学術発表）</w:t>
+            </w:r>
+          </w:p>
+        </w:tc>
+        <w:tc>
+          <w:tcPr>
+            <w:tcW w:type="dxa" w:w="2280"/>
+          </w:tcPr>
+          <w:p>
+            <w:r>
+              <w:rPr>
+                <w:rFonts w:ascii="MS Mincho" w:hAnsi="MS Mincho"/>
+                <w:sz w:val="20"/>
+              </w:rPr>
+              <w:t>岡田直己</w:t>
+            </w:r>
+          </w:p>
+        </w:tc>
+        <w:tc>
+          <w:tcPr>
+            <w:tcW w:type="dxa" w:w="2280"/>
+          </w:tcPr>
+          <w:p>
+            <w:r>
+              <w:rPr>
+                <w:rFonts w:ascii="MS Mincho" w:hAnsi="MS Mincho"/>
+                <w:sz w:val="20"/>
+              </w:rPr>
+              <w:t>診療主任</w:t>
+            </w:r>
+          </w:p>
+        </w:tc>
+        <w:tc>
+          <w:tcPr>
+            <w:tcW w:type="dxa" w:w="2280"/>
+          </w:tcPr>
+          <w:p>
+            <w:r>
+              <w:rPr>
+                <w:rFonts w:ascii="MS Mincho" w:hAnsi="MS Mincho"/>
+                <w:sz w:val="20"/>
+              </w:rPr>
+              <w:t>独立行政法人大阪府立病院機構大阪急性期・総合医療センター</w:t>
             </w:r>
           </w:p>
         </w:tc>
@@ -407,7 +906,7 @@
         <w:rPr>
           <w:sz w:val="21"/>
         </w:rPr>
-        <w:t>本研究は単施設研究（大阪大学医学部附属病院）として実施する。</w:t>
+        <w:t>大阪大学医学部附属病院以外の所属研究協力者は、データ収集には関与せず、データ解析および学術発表への参加のみを担当する。</w:t>
       </w:r>
     </w:p>
     <w:p>
@@ -425,7 +924,7 @@
     <w:p>
       <w:pPr>
         <w:spacing w:after="40"/>
-        <w:ind w:left="567"/>
+        <w:ind w:left="0"/>
       </w:pPr>
       <w:r>
         <w:rPr>
@@ -438,13 +937,13 @@
     <w:p>
       <w:pPr>
         <w:spacing w:after="40"/>
-        <w:ind w:left="567"/>
+        <w:ind w:left="0"/>
       </w:pPr>
       <w:r>
         <w:rPr>
           <w:sz w:val="21"/>
         </w:rPr>
-        <w:t>熱傷は日本において年間10万人以上が医療機関を受診する身近な外傷である（Yoneda K et al., Acute Medicine &amp; Surgery, 2024）。受傷直後の適切な初期対応（十分な流水冷却・適切な受診判断）が予後を左右するにもかかわらず、一般市民が正確な情報に即座にアクセスできる環境は十分に整っていなかった。こうした背景から「Burnova」を開発・公開した。本研究により同アプリの有用性を定量的に評価することで、今後の熱傷啓発活動の発展に向けたエビデンスを提供し、熱傷診療の地域格差解消を目指す社会システム構築の第一歩とする。</w:t>
+        <w:t>熱傷は日本において年間10万人以上が医療機関を受診する身近な外傷である（Yoneda K et al., Acute Medicine &amp; Surgery, 2024）。受傷直後の適切な初期対応（十分な流水冷却・適切な受診判断）が予後を左右するにもかかわらず、一般市民が正確な情報に即座にアクセスできる環境は十分に整っていなかった。また受傷後の応急処置、受診先選定、初期治療後の自宅での対応までを一つの情報サイトで網羅しているものはなく、一般市民が判断に迷うケースは少なくない。こうした背景から熱傷に苦しむ患者及びその家族にとっての不安を解消することを目的として「Burnova」を開発・公開した。本研究は同アプリの有用性を定量的に評価することで、今後の熱傷啓発活動の発展に向けたエビデンスを提供し、熱傷診療の地域格差解消を目指す社会システム構築の第一歩とすることが目的である。</w:t>
       </w:r>
     </w:p>
     <w:p>
@@ -462,13 +961,26 @@
     <w:p>
       <w:pPr>
         <w:spacing w:after="40"/>
-        <w:ind w:left="567"/>
+        <w:ind w:left="0"/>
       </w:pPr>
       <w:r>
         <w:rPr>
           <w:sz w:val="21"/>
         </w:rPr>
-        <w:t>熱傷専門医は全国でも極めて少なく、高度専門医療機能は限られた施設にのみ集中している。2025年、大阪大学医学部附属病院高度救命救急センターは大阪府熱傷センターとして正式に指定されたが、これは逆に言えば、府内でも専門的な熱傷診療が可能な施設が極めて限られることを意味する。専門医不在施設での課題は「受傷前・受傷直後の市民への情報提供」と「医療機関到達後の評価精度」の二層に存在する。本研究が対象とする「Burnova」は前者の課題に対応するツールであり、市民が受傷直後に参照できる応急処置・受診基準情報を提供している。本アプリの有用性・利用実態を科学的に検証することは、熱傷予防・初期対応に関する公衆衛生的エビデンスの構築という観点で重要な意義を持つ。</w:t>
+        <w:t>熱傷専門医は全国でも極めて少なく（2026年3月現在で約370名：日本熱傷学会専門医名簿より）、高度専門医療機能は限られた施設にのみ集中している。熱傷診療における社会としての問題は大きく2つある。1. 一般市民における熱傷リテラシー不足、2. 社会全体として熱傷診療が標準化されないこと、である。2026年、大阪大学医学部附属病院高度救命救急センターは大阪府重症熱傷センターとして正式に指定され重症熱傷患者への対応を担うこととなったが、熱傷患者の多くは軽症〜中等症の患者であり、熱傷専門医が全ての患者を診療することは不可能である。より多くの熱傷患者に対応するには熱傷の知識を持った医療者を増やすか、熱傷に関する我々の知識を一般市民に向けて発信するかしか方法はない。熱傷専門医の数を急激に増やすことは困難であることから、まずは市民に対して熱傷関連情報をウェブアプリで発信する事により、熱傷知識へのアクセシビリティーを確保することで1つ目の課題に対応することが重要であると考えた。2つ目の課題に対しては、今後熱傷患者の創部を画像に収めることで、画像から熱傷面積をAIで推定するシステムの開発、そしてその画像を救急隊や施設間で共有するシステム、そして最終的には撮影した画像を集積するデータセンター構築を行う予定としており、別途研究を行う予定である。</w:t>
+      </w:r>
+    </w:p>
+    <w:p/>
+    <w:p>
+      <w:pPr>
+        <w:spacing w:after="40"/>
+        <w:ind w:left="0"/>
+      </w:pPr>
+      <w:r>
+        <w:rPr>
+          <w:sz w:val="21"/>
+        </w:rPr>
+        <w:t>本研究が対象とする「Burnova」は市民が受傷直後に参照できる応急処置・受診基準情報・受診先選定までを提供している。本アプリの有用性・利用実態を科学的に検証することは、熱傷の重症化予防・初期対応に関する公衆衛生的エビデンスの構築という観点で重要な意義を持つ。</w:t>
       </w:r>
     </w:p>
     <w:p>
@@ -590,10 +1102,21 @@
         <w:rPr>
           <w:sz w:val="21"/>
         </w:rPr>
-        <w:t>【年齢制限】なし。未成年者については保護者等が使用・回答する場合を含む。</w:t>
+        <w:t>【年齢制限】</w:t>
       </w:r>
     </w:p>
-    <w:p/>
+    <w:p>
+      <w:pPr>
+        <w:spacing w:after="40"/>
+        <w:ind w:left="850"/>
+      </w:pPr>
+      <w:r>
+        <w:rPr>
+          <w:sz w:val="21"/>
+        </w:rPr>
+        <w:t>なし。未成年者については保護者等が使用・回答する場合を含む。</w:t>
+      </w:r>
+    </w:p>
     <w:p>
       <w:pPr>
         <w:spacing w:after="40"/>
@@ -640,7 +1163,7 @@
         <w:rPr>
           <w:sz w:val="21"/>
         </w:rPr>
-        <w:t>アプリ内に設置されたアンケートフォームへの任意回答データを収集・解析する。収集項目は以下のとおり。</w:t>
+        <w:t>アプリ内に設置されたアンケートフォームへの任意回答データを収集・解析する。収集項目は以下のとおり。簡易項目（①②）と詳細項目（③〜⑩）を設定した。また、アプリの利用行動に関するデータ（⑪⑫）についても収集する。</w:t>
       </w:r>
     </w:p>
     <w:tbl>
@@ -662,6 +1185,7 @@
           <w:p>
             <w:r>
               <w:rPr>
+                <w:b/>
                 <w:sz w:val="20"/>
               </w:rPr>
               <w:t>番号</w:t>
@@ -675,6 +1199,7 @@
           <w:p>
             <w:r>
               <w:rPr>
+                <w:b/>
                 <w:sz w:val="20"/>
               </w:rPr>
               <w:t>項目名</w:t>
@@ -688,6 +1213,7 @@
           <w:p>
             <w:r>
               <w:rPr>
+                <w:b/>
                 <w:sz w:val="20"/>
               </w:rPr>
               <w:t>内容</w:t>
@@ -703,6 +1229,7 @@
           <w:p>
             <w:r>
               <w:rPr>
+                <w:rFonts w:ascii="MS Mincho" w:hAnsi="MS Mincho"/>
                 <w:sz w:val="20"/>
               </w:rPr>
               <w:t>①</w:t>
@@ -716,6 +1243,7 @@
           <w:p>
             <w:r>
               <w:rPr>
+                <w:rFonts w:ascii="MS Mincho" w:hAnsi="MS Mincho"/>
                 <w:sz w:val="20"/>
               </w:rPr>
               <w:t>ページの有用性</w:t>
@@ -729,6 +1257,7 @@
           <w:p>
             <w:r>
               <w:rPr>
+                <w:rFonts w:ascii="MS Mincho" w:hAnsi="MS Mincho"/>
                 <w:sz w:val="20"/>
               </w:rPr>
               <w:t>「このページは役に立ちましたか？」（はい／いいえ）</w:t>
@@ -744,6 +1273,7 @@
           <w:p>
             <w:r>
               <w:rPr>
+                <w:rFonts w:ascii="MS Mincho" w:hAnsi="MS Mincho"/>
                 <w:sz w:val="20"/>
               </w:rPr>
               <w:t>②</w:t>
@@ -757,6 +1287,7 @@
           <w:p>
             <w:r>
               <w:rPr>
+                <w:rFonts w:ascii="MS Mincho" w:hAnsi="MS Mincho"/>
                 <w:sz w:val="20"/>
               </w:rPr>
               <w:t>ツール満足度</w:t>
@@ -770,6 +1301,7 @@
           <w:p>
             <w:r>
               <w:rPr>
+                <w:rFonts w:ascii="MS Mincho" w:hAnsi="MS Mincho"/>
                 <w:sz w:val="20"/>
               </w:rPr>
               <w:t>5点満点のリッカートスケール</w:t>
@@ -785,6 +1317,7 @@
           <w:p>
             <w:r>
               <w:rPr>
+                <w:rFonts w:ascii="MS Mincho" w:hAnsi="MS Mincho"/>
                 <w:sz w:val="20"/>
               </w:rPr>
               <w:t>③</w:t>
@@ -798,6 +1331,7 @@
           <w:p>
             <w:r>
               <w:rPr>
+                <w:rFonts w:ascii="MS Mincho" w:hAnsi="MS Mincho"/>
                 <w:sz w:val="20"/>
               </w:rPr>
               <w:t>使用者の属性</w:t>
@@ -811,6 +1345,7 @@
           <w:p>
             <w:r>
               <w:rPr>
+                <w:rFonts w:ascii="MS Mincho" w:hAnsi="MS Mincho"/>
                 <w:sz w:val="20"/>
               </w:rPr>
               <w:t>「誰がこのツールを使用しましたか？」</w:t>
@@ -826,6 +1361,7 @@
           <w:p>
             <w:r>
               <w:rPr>
+                <w:rFonts w:ascii="MS Mincho" w:hAnsi="MS Mincho"/>
                 <w:sz w:val="20"/>
               </w:rPr>
               <w:t>④</w:t>
@@ -839,6 +1375,7 @@
           <w:p>
             <w:r>
               <w:rPr>
+                <w:rFonts w:ascii="MS Mincho" w:hAnsi="MS Mincho"/>
                 <w:sz w:val="20"/>
               </w:rPr>
               <w:t>熱傷患者の年齢層</w:t>
@@ -852,6 +1389,7 @@
           <w:p>
             <w:r>
               <w:rPr>
+                <w:rFonts w:ascii="MS Mincho" w:hAnsi="MS Mincho"/>
                 <w:sz w:val="20"/>
               </w:rPr>
               <w:t>やけどした人の年齢区分</w:t>
@@ -867,6 +1405,7 @@
           <w:p>
             <w:r>
               <w:rPr>
+                <w:rFonts w:ascii="MS Mincho" w:hAnsi="MS Mincho"/>
                 <w:sz w:val="20"/>
               </w:rPr>
               <w:t>⑤</w:t>
@@ -880,6 +1419,7 @@
           <w:p>
             <w:r>
               <w:rPr>
+                <w:rFonts w:ascii="MS Mincho" w:hAnsi="MS Mincho"/>
                 <w:sz w:val="20"/>
               </w:rPr>
               <w:t>熱傷の原因</w:t>
@@ -893,6 +1433,7 @@
           <w:p>
             <w:r>
               <w:rPr>
+                <w:rFonts w:ascii="MS Mincho" w:hAnsi="MS Mincho"/>
                 <w:sz w:val="20"/>
               </w:rPr>
               <w:t>やけどの原因（選択肢より選択）</w:t>
@@ -908,6 +1449,7 @@
           <w:p>
             <w:r>
               <w:rPr>
+                <w:rFonts w:ascii="MS Mincho" w:hAnsi="MS Mincho"/>
                 <w:sz w:val="20"/>
               </w:rPr>
               <w:t>⑥</w:t>
@@ -921,6 +1463,7 @@
           <w:p>
             <w:r>
               <w:rPr>
+                <w:rFonts w:ascii="MS Mincho" w:hAnsi="MS Mincho"/>
                 <w:sz w:val="20"/>
               </w:rPr>
               <w:t>閲覧後の行動変化</w:t>
@@ -934,6 +1477,7 @@
           <w:p>
             <w:r>
               <w:rPr>
+                <w:rFonts w:ascii="MS Mincho" w:hAnsi="MS Mincho"/>
                 <w:sz w:val="20"/>
               </w:rPr>
               <w:t>「このページを見て行動は変わりましたか？」</w:t>
@@ -949,6 +1493,7 @@
           <w:p>
             <w:r>
               <w:rPr>
+                <w:rFonts w:ascii="MS Mincho" w:hAnsi="MS Mincho"/>
                 <w:sz w:val="20"/>
               </w:rPr>
               <w:t>⑦</w:t>
@@ -962,6 +1507,7 @@
           <w:p>
             <w:r>
               <w:rPr>
+                <w:rFonts w:ascii="MS Mincho" w:hAnsi="MS Mincho"/>
                 <w:sz w:val="20"/>
               </w:rPr>
               <w:t>都道府県</w:t>
@@ -975,6 +1521,7 @@
           <w:p>
             <w:r>
               <w:rPr>
+                <w:rFonts w:ascii="MS Mincho" w:hAnsi="MS Mincho"/>
                 <w:sz w:val="20"/>
               </w:rPr>
               <w:t>任意回答</w:t>
@@ -990,6 +1537,7 @@
           <w:p>
             <w:r>
               <w:rPr>
+                <w:rFonts w:ascii="MS Mincho" w:hAnsi="MS Mincho"/>
                 <w:sz w:val="20"/>
               </w:rPr>
               <w:t>⑧</w:t>
@@ -1003,6 +1551,7 @@
           <w:p>
             <w:r>
               <w:rPr>
+                <w:rFonts w:ascii="MS Mincho" w:hAnsi="MS Mincho"/>
                 <w:sz w:val="20"/>
               </w:rPr>
               <w:t>熱傷部位</w:t>
@@ -1016,6 +1565,7 @@
           <w:p>
             <w:r>
               <w:rPr>
+                <w:rFonts w:ascii="MS Mincho" w:hAnsi="MS Mincho"/>
                 <w:sz w:val="20"/>
               </w:rPr>
               <w:t>顔面・頭頸部／手（手指含む）／足／体幹部／陰部／その他（複数選択可）</w:t>
@@ -1031,6 +1581,7 @@
           <w:p>
             <w:r>
               <w:rPr>
+                <w:rFonts w:ascii="MS Mincho" w:hAnsi="MS Mincho"/>
                 <w:sz w:val="20"/>
               </w:rPr>
               <w:t>⑨</w:t>
@@ -1044,6 +1595,7 @@
           <w:p>
             <w:r>
               <w:rPr>
+                <w:rFonts w:ascii="MS Mincho" w:hAnsi="MS Mincho"/>
                 <w:sz w:val="20"/>
               </w:rPr>
               <w:t>情報の信頼度</w:t>
@@ -1057,6 +1609,7 @@
           <w:p>
             <w:r>
               <w:rPr>
+                <w:rFonts w:ascii="MS Mincho" w:hAnsi="MS Mincho"/>
                 <w:sz w:val="20"/>
               </w:rPr>
               <w:t>「この情報は信頼できると思いますか？」（1〜5段階）</w:t>
@@ -1072,6 +1625,7 @@
           <w:p>
             <w:r>
               <w:rPr>
+                <w:rFonts w:ascii="MS Mincho" w:hAnsi="MS Mincho"/>
                 <w:sz w:val="20"/>
               </w:rPr>
               <w:t>⑩</w:t>
@@ -1085,6 +1639,7 @@
           <w:p>
             <w:r>
               <w:rPr>
+                <w:rFonts w:ascii="MS Mincho" w:hAnsi="MS Mincho"/>
                 <w:sz w:val="20"/>
               </w:rPr>
               <w:t>自由記述</w:t>
@@ -1098,9 +1653,98 @@
           <w:p>
             <w:r>
               <w:rPr>
+                <w:rFonts w:ascii="MS Mincho" w:hAnsi="MS Mincho"/>
                 <w:sz w:val="20"/>
               </w:rPr>
               <w:t>追加してほしい機能・改善点（任意）</w:t>
+            </w:r>
+          </w:p>
+        </w:tc>
+      </w:tr>
+      <w:tr>
+        <w:tc>
+          <w:tcPr>
+            <w:tcW w:type="dxa" w:w="3041"/>
+          </w:tcPr>
+          <w:p>
+            <w:r>
+              <w:rPr>
+                <w:rFonts w:ascii="MS Mincho" w:hAnsi="MS Mincho"/>
+                <w:sz w:val="20"/>
+              </w:rPr>
+              <w:t>⑪</w:t>
+            </w:r>
+          </w:p>
+        </w:tc>
+        <w:tc>
+          <w:tcPr>
+            <w:tcW w:type="dxa" w:w="3041"/>
+          </w:tcPr>
+          <w:p>
+            <w:r>
+              <w:rPr>
+                <w:rFonts w:ascii="MS Mincho" w:hAnsi="MS Mincho"/>
+                <w:sz w:val="20"/>
+              </w:rPr>
+              <w:t>最終押下ボタン</w:t>
+            </w:r>
+          </w:p>
+        </w:tc>
+        <w:tc>
+          <w:tcPr>
+            <w:tcW w:type="dxa" w:w="3041"/>
+          </w:tcPr>
+          <w:p>
+            <w:r>
+              <w:rPr>
+                <w:rFonts w:ascii="MS Mincho" w:hAnsi="MS Mincho"/>
+                <w:sz w:val="20"/>
+              </w:rPr>
+              <w:t>アンケート回答時に最後に押下したボタンの種類</w:t>
+            </w:r>
+          </w:p>
+        </w:tc>
+      </w:tr>
+      <w:tr>
+        <w:tc>
+          <w:tcPr>
+            <w:tcW w:type="dxa" w:w="3041"/>
+          </w:tcPr>
+          <w:p>
+            <w:r>
+              <w:rPr>
+                <w:rFonts w:ascii="MS Mincho" w:hAnsi="MS Mincho"/>
+                <w:sz w:val="20"/>
+              </w:rPr>
+              <w:t>⑫</w:t>
+            </w:r>
+          </w:p>
+        </w:tc>
+        <w:tc>
+          <w:tcPr>
+            <w:tcW w:type="dxa" w:w="3041"/>
+          </w:tcPr>
+          <w:p>
+            <w:r>
+              <w:rPr>
+                <w:rFonts w:ascii="MS Mincho" w:hAnsi="MS Mincho"/>
+                <w:sz w:val="20"/>
+              </w:rPr>
+              <w:t>行動決定までの時間</w:t>
+            </w:r>
+          </w:p>
+        </w:tc>
+        <w:tc>
+          <w:tcPr>
+            <w:tcW w:type="dxa" w:w="3041"/>
+          </w:tcPr>
+          <w:p>
+            <w:r>
+              <w:rPr>
+                <w:rFonts w:ascii="MS Mincho" w:hAnsi="MS Mincho"/>
+                <w:sz w:val="20"/>
+              </w:rPr>
+              <w:t>ページ閲覧から行動決定（ボタン押下）までの時間</w:t>
             </w:r>
           </w:p>
         </w:tc>
@@ -1224,6 +1868,18 @@
         <w:rPr>
           <w:sz w:val="21"/>
         </w:rPr>
+        <w:t>最終押下ボタンの分布・行動決定までの時間の分布</w:t>
+      </w:r>
+    </w:p>
+    <w:p>
+      <w:pPr>
+        <w:spacing w:after="40"/>
+        <w:ind w:left="850"/>
+      </w:pPr>
+      <w:r>
+        <w:rPr>
+          <w:sz w:val="21"/>
+        </w:rPr>
         <w:t>自由記述の質的分析</w:t>
       </w:r>
     </w:p>
@@ -1282,6 +1938,7 @@
           <w:p>
             <w:r>
               <w:rPr>
+                <w:rFonts w:ascii="MS Mincho" w:hAnsi="MS Mincho"/>
                 <w:sz w:val="21"/>
               </w:rPr>
               <w:t>データ収集期間</w:t>
@@ -1295,6 +1952,7 @@
           <w:p>
             <w:r>
               <w:rPr>
+                <w:rFonts w:ascii="MS Mincho" w:hAnsi="MS Mincho"/>
                 <w:sz w:val="21"/>
               </w:rPr>
               <w:t>アプリ公開日（2026年3月23日）〜 2030年3月31日</w:t>
@@ -1310,6 +1968,7 @@
           <w:p>
             <w:r>
               <w:rPr>
+                <w:rFonts w:ascii="MS Mincho" w:hAnsi="MS Mincho"/>
                 <w:sz w:val="21"/>
               </w:rPr>
               <w:t>研究期間（全体）</w:t>
@@ -1323,9 +1982,10 @@
           <w:p>
             <w:r>
               <w:rPr>
+                <w:rFonts w:ascii="MS Mincho" w:hAnsi="MS Mincho"/>
                 <w:sz w:val="21"/>
               </w:rPr>
-              <w:t>研究機関の長の許可日 〜 2031年3月31日</w:t>
+              <w:t>研究機関の長の許可日 〜 2031年12月31日</w:t>
             </w:r>
           </w:p>
         </w:tc>
@@ -1358,7 +2018,7 @@
     <w:p>
       <w:pPr>
         <w:spacing w:after="40"/>
-        <w:ind w:left="567"/>
+        <w:ind w:left="0"/>
       </w:pPr>
       <w:r>
         <w:rPr>
@@ -1370,6 +2030,7 @@
     <w:p/>
     <w:p>
       <w:pPr>
+        <w:spacing w:after="40"/>
         <w:ind w:left="850"/>
       </w:pPr>
       <w:r>
@@ -1384,25 +2045,25 @@
     <w:p>
       <w:pPr>
         <w:spacing w:after="40"/>
-        <w:ind w:left="567"/>
+        <w:ind w:left="0"/>
       </w:pPr>
       <w:r>
         <w:rPr>
           <w:sz w:val="21"/>
         </w:rPr>
-        <w:t>上記に基づき、回答者は研究利用について告知を受けた上で自発的に回答しており、オプトアウト方式による同意が成立していると判断する。オプトアウトを希望する場合は、アンケートに回答しないことで参加を拒否できる。本研究に関する情報は大阪大学医学部附属病院のウェブサイトおよびアプリ内に掲示し、研究対象者からの申し出があった場合はその時点以降のデータを解析対象から除外する。</w:t>
+        <w:t>上記に基づき、回答者は研究利用について告知を受けた上で自発的に回答しており、オプトアウト方式による同意が成立していると判断する。オプトアウトを希望する場合は、アンケートに回答しないことで参加を拒否できる。本研究に関する情報はアプリ内に掲示し、研究対象者からの申し出があった場合はその時点以降のデータを解析対象から除外する。</w:t>
       </w:r>
     </w:p>
     <w:p>
       <w:pPr>
         <w:spacing w:after="40"/>
-        <w:ind w:left="567"/>
+        <w:ind w:left="0"/>
       </w:pPr>
       <w:r>
         <w:rPr>
           <w:sz w:val="21"/>
         </w:rPr>
-        <w:t>退院した患者の既存情報のみを対象とする場合と同様、匿名性が担保されかつ個別追跡が不可能なデータであることから、個別の文書による同意取得は省略する。</w:t>
+        <w:t>匿名性が担保されかつ個別追跡が不可能なデータであることから、個別の文書による同意取得は省略する。</w:t>
       </w:r>
     </w:p>
     <w:p>
@@ -1420,7 +2081,7 @@
     <w:p>
       <w:pPr>
         <w:spacing w:after="40"/>
-        <w:ind w:left="567"/>
+        <w:ind w:left="0"/>
       </w:pPr>
       <w:r>
         <w:rPr>
@@ -1444,7 +2105,7 @@
     <w:p>
       <w:pPr>
         <w:spacing w:after="40"/>
-        <w:ind w:left="567"/>
+        <w:ind w:left="0"/>
       </w:pPr>
       <w:r>
         <w:rPr>
@@ -1456,7 +2117,7 @@
     <w:p>
       <w:pPr>
         <w:spacing w:after="40"/>
-        <w:ind w:left="850"/>
+        <w:ind w:left="283"/>
       </w:pPr>
       <w:r>
         <w:rPr>
@@ -1468,19 +2129,19 @@
     <w:p>
       <w:pPr>
         <w:spacing w:after="40"/>
-        <w:ind w:left="850"/>
+        <w:ind w:left="283"/>
       </w:pPr>
       <w:r>
         <w:rPr>
           <w:sz w:val="21"/>
         </w:rPr>
-        <w:t>・収集項目は、年齢層・熱傷部位・熱傷原因・都道府県（任意）・満足度・行動変化・信頼度・自由記述のみである。</w:t>
+        <w:t>・収集項目は、年齢層・熱傷部位・熱傷原因・都道府県（任意）・満足度・行動変化・信頼度・最終押下ボタン・行動決定までの時間・自由記述のみである。</w:t>
       </w:r>
     </w:p>
     <w:p>
       <w:pPr>
         <w:spacing w:after="40"/>
-        <w:ind w:left="850"/>
+        <w:ind w:left="283"/>
       </w:pPr>
       <w:r>
         <w:rPr>
@@ -1492,7 +2153,7 @@
     <w:p>
       <w:pPr>
         <w:spacing w:after="40"/>
-        <w:ind w:left="850"/>
+        <w:ind w:left="283"/>
       </w:pPr>
       <w:r>
         <w:rPr>
@@ -1504,7 +2165,7 @@
     <w:p>
       <w:pPr>
         <w:spacing w:after="40"/>
-        <w:ind w:left="850"/>
+        <w:ind w:left="283"/>
       </w:pPr>
       <w:r>
         <w:rPr>
@@ -1528,7 +2189,7 @@
     <w:p>
       <w:pPr>
         <w:spacing w:after="40"/>
-        <w:ind w:left="567"/>
+        <w:ind w:left="0"/>
       </w:pPr>
       <w:r>
         <w:rPr>
@@ -1614,7 +2275,7 @@
     <w:p>
       <w:pPr>
         <w:spacing w:after="40"/>
-        <w:ind w:left="567"/>
+        <w:ind w:left="0"/>
       </w:pPr>
       <w:r>
         <w:rPr>
@@ -1638,7 +2299,7 @@
     <w:p>
       <w:pPr>
         <w:spacing w:after="40"/>
-        <w:ind w:left="567"/>
+        <w:ind w:left="0"/>
       </w:pPr>
       <w:r>
         <w:rPr>
@@ -1650,7 +2311,7 @@
     <w:p>
       <w:pPr>
         <w:spacing w:after="40"/>
-        <w:ind w:left="850"/>
+        <w:ind w:left="283"/>
       </w:pPr>
       <w:r>
         <w:rPr>
@@ -1662,7 +2323,7 @@
     <w:p>
       <w:pPr>
         <w:spacing w:after="40"/>
-        <w:ind w:left="850"/>
+        <w:ind w:left="283"/>
       </w:pPr>
       <w:r>
         <w:rPr>
@@ -1674,7 +2335,7 @@
     <w:p>
       <w:pPr>
         <w:spacing w:after="40"/>
-        <w:ind w:left="850"/>
+        <w:ind w:left="283"/>
       </w:pPr>
       <w:r>
         <w:rPr>
@@ -1686,7 +2347,7 @@
     <w:p>
       <w:pPr>
         <w:spacing w:after="40"/>
-        <w:ind w:left="850"/>
+        <w:ind w:left="283"/>
       </w:pPr>
       <w:r>
         <w:rPr>
@@ -1710,13 +2371,13 @@
     <w:p>
       <w:pPr>
         <w:spacing w:after="40"/>
-        <w:ind w:left="567"/>
+        <w:ind w:left="0"/>
       </w:pPr>
       <w:r>
         <w:rPr>
           <w:sz w:val="21"/>
         </w:rPr>
-        <w:t>本研究の実施にあたり現時点では外部研究費は取得していない。今後、公的資金（JST等）を使用することがある。その際は倫理審査委員会に報告する。アプリ「Burnova」の開発・運営費用は研究責任者が個人で負担しており、企業等からの資金提供はない。</w:t>
+        <w:t>本研究の実施にあたり現時点では外部研究費は取得していない。今後、公的資金（JST、AI for science等）を使用することがある。その際は倫理審査委員会に報告する。アプリ「Burnova」の開発・運営費用は研究責任者が個人で負担しており、企業等からの資金提供はない。</w:t>
       </w:r>
     </w:p>
     <w:p>
@@ -1734,7 +2395,7 @@
     <w:p>
       <w:pPr>
         <w:spacing w:after="40"/>
-        <w:ind w:left="567"/>
+        <w:ind w:left="0"/>
       </w:pPr>
       <w:r>
         <w:rPr>
@@ -1758,13 +2419,13 @@
     <w:p>
       <w:pPr>
         <w:spacing w:after="40"/>
-        <w:ind w:left="567"/>
+        <w:ind w:left="0"/>
       </w:pPr>
       <w:r>
         <w:rPr>
           <w:sz w:val="21"/>
         </w:rPr>
-        <w:t>研究成果は、研究対象者を特定できないようにした上で、研究会、学会や学術雑誌等で公表する（2026年度 日本救急医学会 等を予定）。本研究の実施に関する情報を大阪大学医学部附属病院のウェブサイトおよびアプリ内に公表する。</w:t>
+        <w:t>研究成果は、研究対象者を特定できないようにした上で、研究会、学会や学術雑誌等で公表する（2026年度 日本救急医学会 等を予定）。本研究の実施に関する情報をアプリ内に公表する。</w:t>
       </w:r>
     </w:p>
     <w:p>
@@ -1782,13 +2443,13 @@
     <w:p>
       <w:pPr>
         <w:spacing w:after="40"/>
-        <w:ind w:left="567"/>
+        <w:ind w:left="0"/>
       </w:pPr>
       <w:r>
         <w:rPr>
           <w:sz w:val="21"/>
         </w:rPr>
-        <w:t>研究成果に関しては学会発表・論文掲載後にホームページ等で公開する。研究対象者への個別フィードバックは行わない（匿名データのため識別不可）。</w:t>
+        <w:t>研究成果に関しては学会発表・論文掲載された際には適宜当診療科のウェブサイトで公開する。研究対象者への個別フィードバックは行わない（匿名データのため識別不可）。</w:t>
       </w:r>
     </w:p>
     <w:p>
@@ -1806,7 +2467,7 @@
     <w:p>
       <w:pPr>
         <w:spacing w:after="40"/>
-        <w:ind w:left="567"/>
+        <w:ind w:left="0"/>
       </w:pPr>
       <w:r>
         <w:rPr>
@@ -1819,19 +2480,19 @@
     <w:p>
       <w:pPr>
         <w:spacing w:after="40"/>
-        <w:ind w:left="567"/>
+        <w:ind w:left="283"/>
       </w:pPr>
       <w:r>
         <w:rPr>
           <w:sz w:val="21"/>
         </w:rPr>
-        <w:t>研究責任者：米田　和弘</w:t>
+        <w:t>研究責任者：米田　和弘（特任助教）</w:t>
       </w:r>
     </w:p>
     <w:p>
       <w:pPr>
         <w:spacing w:after="40"/>
-        <w:ind w:left="567"/>
+        <w:ind w:left="283"/>
       </w:pPr>
       <w:r>
         <w:rPr>
@@ -1843,7 +2504,7 @@
     <w:p>
       <w:pPr>
         <w:spacing w:after="40"/>
-        <w:ind w:left="567"/>
+        <w:ind w:left="283"/>
       </w:pPr>
       <w:r>
         <w:rPr>
@@ -1855,7 +2516,7 @@
     <w:p>
       <w:pPr>
         <w:spacing w:after="40"/>
-        <w:ind w:left="567"/>
+        <w:ind w:left="283"/>
       </w:pPr>
       <w:r>
         <w:rPr>
@@ -1879,7 +2540,7 @@
     <w:p>
       <w:pPr>
         <w:spacing w:after="40"/>
-        <w:ind w:left="567"/>
+        <w:ind w:left="0"/>
       </w:pPr>
       <w:r>
         <w:rPr>
@@ -1903,7 +2564,7 @@
     <w:p>
       <w:pPr>
         <w:spacing w:after="40"/>
-        <w:ind w:left="567"/>
+        <w:ind w:left="0"/>
       </w:pPr>
       <w:r>
         <w:rPr>
@@ -1927,7 +2588,7 @@
     <w:p>
       <w:pPr>
         <w:spacing w:after="40"/>
-        <w:ind w:left="567"/>
+        <w:ind w:left="0"/>
       </w:pPr>
       <w:r>
         <w:rPr>
@@ -1951,7 +2612,7 @@
     <w:p>
       <w:pPr>
         <w:spacing w:after="40"/>
-        <w:ind w:left="567"/>
+        <w:ind w:left="0"/>
       </w:pPr>
       <w:r>
         <w:rPr>
@@ -1975,7 +2636,7 @@
     <w:p>
       <w:pPr>
         <w:spacing w:after="40"/>
-        <w:ind w:left="567"/>
+        <w:ind w:left="0"/>
       </w:pPr>
       <w:r>
         <w:rPr>
@@ -1999,7 +2660,7 @@
     <w:p>
       <w:pPr>
         <w:spacing w:after="40"/>
-        <w:ind w:left="567"/>
+        <w:ind w:left="0"/>
       </w:pPr>
       <w:r>
         <w:rPr>
@@ -2023,7 +2684,7 @@
     <w:p>
       <w:pPr>
         <w:spacing w:after="40"/>
-        <w:ind w:left="567"/>
+        <w:ind w:left="0"/>
       </w:pPr>
       <w:r>
         <w:rPr>

</xml_diff>